<commit_message>
Corrige acentuacao no Word processo_visao_estoque_glpi
</commit_message>
<xml_diff>
--- a/documentações/Processos/docx/processo_visao_estoque_glpi.docx
+++ b/documentações/Processos/docx/processo_visao_estoque_glpi.docx
@@ -41,7 +41,7 @@
           <w:color w:val="5E6B78"/>
           <w:sz w:val="19"/>
         </w:rPr>
-        <w:t>Ãrea responsÃ¡vel e versÃ£o conforme documentaÃ§Ã£o institucional</w:t>
+        <w:t>Área responsável e versão conforme documentação institucional</w:t>
       </w:r>
     </w:p>
     <w:p>
@@ -2430,6 +2430,8 @@
     <w:sectPr>
       <w:headerReference w:type="default" r:id="rId9"/>
       <w:footerReference w:type="default" r:id="rId10"/>
+      <w:headerReference w:type="first" r:id="rId11"/>
+      <w:footerReference w:type="first" r:id="rId12"/>
       <w:pgSz w:w="12240" w:h="15840"/>
       <w:pgMar w:top="1080" w:right="1123" w:bottom="1080" w:left="1123" w:header="504" w:footer="504" w:gutter="0"/>
       <w:cols w:space="720"/>
@@ -2452,7 +2454,7 @@
         <w:color w:val="5E6B78"/>
         <w:sz w:val="17"/>
       </w:rPr>
-      <w:t xml:space="preserve">Secretaria de SaÃºde do Recife  |  </w:t>
+      <w:t xml:space="preserve">Secretaria de Saúde do Recife  |  </w:t>
     </w:r>
     <w:r>
       <w:rPr>
@@ -2460,9 +2462,19 @@
         <w:color w:val="5E6B78"/>
         <w:sz w:val="18"/>
       </w:rPr>
-      <w:t xml:space="preserve">PÃ¡gina </w:t>
+      <w:t xml:space="preserve">Página </w:t>
     </w:r>
     <w:fldSimple w:instr="PAGE"/>
+  </w:p>
+</w:ftr>
+</file>
+
+<file path=word/footer2.xml><?xml version="1.0" encoding="utf-8"?>
+<w:ftr xmlns:m="http://schemas.openxmlformats.org/officeDocument/2006/math" xmlns:mc="http://schemas.openxmlformats.org/markup-compatibility/2006" xmlns:mo="http://schemas.microsoft.com/office/mac/office/2008/main" xmlns:mv="urn:schemas-microsoft-com:mac:vml" xmlns:o="urn:schemas-microsoft-com:office:office" xmlns:r="http://schemas.openxmlformats.org/officeDocument/2006/relationships" xmlns:v="urn:schemas-microsoft-com:vml" xmlns:w10="urn:schemas-microsoft-com:office:word" xmlns:w14="http://schemas.microsoft.com/office/word/2010/wordml" xmlns:w="http://schemas.openxmlformats.org/wordprocessingml/2006/main" xmlns:wne="http://schemas.microsoft.com/office/word/2006/wordml" xmlns:wp14="http://schemas.microsoft.com/office/word/2010/wordprocessingDrawing" xmlns:wp="http://schemas.openxmlformats.org/drawingml/2006/wordprocessingDrawing" xmlns:wpc="http://schemas.microsoft.com/office/word/2010/wordprocessingCanvas" xmlns:wpg="http://schemas.microsoft.com/office/word/2010/wordprocessingGroup" xmlns:wpi="http://schemas.microsoft.com/office/word/2010/wordprocessingInk" xmlns:wps="http://schemas.microsoft.com/office/word/2010/wordprocessingShape" mc:Ignorable="w14 wp14">
+  <w:p>
+    <w:pPr>
+      <w:pStyle w:val="Footer"/>
+    </w:pPr>
   </w:p>
 </w:ftr>
 </file>
@@ -2481,8 +2493,18 @@
         <w:color w:val="5E6B78"/>
         <w:sz w:val="17"/>
       </w:rPr>
-      <w:t>SAÃšDE DIGITAL ATENDE  |  PROCESSO OPERACIONAL</w:t>
+      <w:t>SAÚDE DIGITAL ATENDE  |  PROCESSO OPERACIONAL</w:t>
     </w:r>
+  </w:p>
+</w:hdr>
+</file>
+
+<file path=word/header2.xml><?xml version="1.0" encoding="utf-8"?>
+<w:hdr xmlns:m="http://schemas.openxmlformats.org/officeDocument/2006/math" xmlns:mc="http://schemas.openxmlformats.org/markup-compatibility/2006" xmlns:mo="http://schemas.microsoft.com/office/mac/office/2008/main" xmlns:mv="urn:schemas-microsoft-com:mac:vml" xmlns:o="urn:schemas-microsoft-com:office:office" xmlns:r="http://schemas.openxmlformats.org/officeDocument/2006/relationships" xmlns:v="urn:schemas-microsoft-com:vml" xmlns:w10="urn:schemas-microsoft-com:office:word" xmlns:w14="http://schemas.microsoft.com/office/word/2010/wordml" xmlns:w="http://schemas.openxmlformats.org/wordprocessingml/2006/main" xmlns:wne="http://schemas.microsoft.com/office/word/2006/wordml" xmlns:wp14="http://schemas.microsoft.com/office/word/2010/wordprocessingDrawing" xmlns:wp="http://schemas.openxmlformats.org/drawingml/2006/wordprocessingDrawing" xmlns:wpc="http://schemas.microsoft.com/office/word/2010/wordprocessingCanvas" xmlns:wpg="http://schemas.microsoft.com/office/word/2010/wordprocessingGroup" xmlns:wpi="http://schemas.microsoft.com/office/word/2010/wordprocessingInk" xmlns:wps="http://schemas.microsoft.com/office/word/2010/wordprocessingShape" mc:Ignorable="w14 wp14">
+  <w:p>
+    <w:pPr>
+      <w:pStyle w:val="Header"/>
+    </w:pPr>
   </w:p>
 </w:hdr>
 </file>

</xml_diff>

<commit_message>
Atualiza Word padronizado processo_visao_estoque_glpi
</commit_message>
<xml_diff>
--- a/documentações/Processos/docx/processo_visao_estoque_glpi.docx
+++ b/documentações/Processos/docx/processo_visao_estoque_glpi.docx
@@ -399,392 +399,7 @@
         <w:pStyle w:val="Heading1"/>
       </w:pPr>
       <w:r>
-        <w:t>Definições</w:t>
-      </w:r>
-    </w:p>
-    <w:tbl>
-      <w:tblPr>
-        <w:tblStyle w:val="TableGrid"/>
-        <w:tblW w:type="auto" w:w="0"/>
-        <w:jc w:val="center"/>
-        <w:tblLayout w:type="fixed"/>
-        <w:tblLook w:firstColumn="1" w:firstRow="1" w:lastColumn="0" w:lastRow="0" w:noHBand="0" w:noVBand="1" w:val="04A0"/>
-      </w:tblPr>
-      <w:tblGrid>
-        <w:gridCol w:w="2600"/>
-        <w:gridCol w:w="6760"/>
-      </w:tblGrid>
-      <w:tr>
-        <w:trPr>
-          <w:tblHeader w:val="true"/>
-        </w:trPr>
-        <w:tc>
-          <w:tcPr>
-            <w:tcW w:type="dxa" w:w="2600"/>
-            <w:tcMar>
-              <w:top w:w="90" w:type="dxa"/>
-              <w:start w:w="120" w:type="dxa"/>
-              <w:bottom w:w="90" w:type="dxa"/>
-              <w:end w:w="120" w:type="dxa"/>
-            </w:tcMar>
-            <w:vAlign w:val="center"/>
-            <w:shd w:fill="EAF2F8"/>
-          </w:tcPr>
-          <w:p>
-            <w:pPr>
-              <w:spacing w:after="0"/>
-            </w:pPr>
-            <w:r>
-              <w:rPr>
-                <w:rFonts w:ascii="Arial" w:hAnsi="Arial"/>
-                <w:b/>
-                <w:color w:val="163A63"/>
-                <w:sz w:val="18"/>
-              </w:rPr>
-              <w:t>Termo</w:t>
-            </w:r>
-          </w:p>
-        </w:tc>
-        <w:tc>
-          <w:tcPr>
-            <w:tcW w:type="dxa" w:w="6760"/>
-            <w:tcMar>
-              <w:top w:w="90" w:type="dxa"/>
-              <w:start w:w="120" w:type="dxa"/>
-              <w:bottom w:w="90" w:type="dxa"/>
-              <w:end w:w="120" w:type="dxa"/>
-            </w:tcMar>
-            <w:vAlign w:val="center"/>
-            <w:shd w:fill="EAF2F8"/>
-          </w:tcPr>
-          <w:p>
-            <w:pPr>
-              <w:spacing w:after="0"/>
-            </w:pPr>
-            <w:r>
-              <w:rPr>
-                <w:rFonts w:ascii="Arial" w:hAnsi="Arial"/>
-                <w:b/>
-                <w:color w:val="163A63"/>
-                <w:sz w:val="18"/>
-              </w:rPr>
-              <w:t>Definição</w:t>
-            </w:r>
-          </w:p>
-        </w:tc>
-      </w:tr>
-      <w:tr>
-        <w:tc>
-          <w:tcPr>
-            <w:tcW w:type="dxa" w:w="2600"/>
-            <w:tcMar>
-              <w:top w:w="90" w:type="dxa"/>
-              <w:start w:w="120" w:type="dxa"/>
-              <w:bottom w:w="90" w:type="dxa"/>
-              <w:end w:w="120" w:type="dxa"/>
-            </w:tcMar>
-            <w:vAlign w:val="center"/>
-          </w:tcPr>
-          <w:p>
-            <w:pPr>
-              <w:spacing w:after="0"/>
-            </w:pPr>
-            <w:r>
-              <w:rPr>
-                <w:rFonts w:ascii="Arial" w:hAnsi="Arial"/>
-                <w:sz w:val="18"/>
-              </w:rPr>
-              <w:t>GLPI</w:t>
-            </w:r>
-          </w:p>
-        </w:tc>
-        <w:tc>
-          <w:tcPr>
-            <w:tcW w:type="dxa" w:w="6760"/>
-            <w:tcMar>
-              <w:top w:w="90" w:type="dxa"/>
-              <w:start w:w="120" w:type="dxa"/>
-              <w:bottom w:w="90" w:type="dxa"/>
-              <w:end w:w="120" w:type="dxa"/>
-            </w:tcMar>
-            <w:vAlign w:val="center"/>
-          </w:tcPr>
-          <w:p>
-            <w:pPr>
-              <w:spacing w:after="0"/>
-            </w:pPr>
-            <w:r>
-              <w:rPr>
-                <w:rFonts w:ascii="Arial" w:hAnsi="Arial"/>
-                <w:sz w:val="18"/>
-              </w:rPr>
-              <w:t>Sistema de gestão de chamados e inventário de TI utilizado pela GTIC.</w:t>
-            </w:r>
-          </w:p>
-        </w:tc>
-      </w:tr>
-      <w:tr>
-        <w:tc>
-          <w:tcPr>
-            <w:tcW w:type="dxa" w:w="2600"/>
-            <w:tcMar>
-              <w:top w:w="90" w:type="dxa"/>
-              <w:start w:w="120" w:type="dxa"/>
-              <w:bottom w:w="90" w:type="dxa"/>
-              <w:end w:w="120" w:type="dxa"/>
-            </w:tcMar>
-            <w:vAlign w:val="center"/>
-          </w:tcPr>
-          <w:p>
-            <w:pPr>
-              <w:spacing w:after="0"/>
-            </w:pPr>
-            <w:r>
-              <w:rPr>
-                <w:rFonts w:ascii="Arial" w:hAnsi="Arial"/>
-                <w:sz w:val="18"/>
-              </w:rPr>
-              <w:t>Visão de Estoque</w:t>
-            </w:r>
-          </w:p>
-        </w:tc>
-        <w:tc>
-          <w:tcPr>
-            <w:tcW w:type="dxa" w:w="6760"/>
-            <w:tcMar>
-              <w:top w:w="90" w:type="dxa"/>
-              <w:start w:w="120" w:type="dxa"/>
-              <w:bottom w:w="90" w:type="dxa"/>
-              <w:end w:w="120" w:type="dxa"/>
-            </w:tcMar>
-            <w:vAlign w:val="center"/>
-          </w:tcPr>
-          <w:p>
-            <w:pPr>
-              <w:spacing w:after="0"/>
-            </w:pPr>
-            <w:r>
-              <w:rPr>
-                <w:rFonts w:ascii="Arial" w:hAnsi="Arial"/>
-                <w:sz w:val="18"/>
-              </w:rPr>
-              <w:t>Conceito: uma forma organizada de consultar, dentro do GLPI, todos os ativos que estão fora de uso ativo — reunindo em um único lugar o que hoje está disperso entre diferentes localizações de estoque.</w:t>
-            </w:r>
-          </w:p>
-        </w:tc>
-      </w:tr>
-      <w:tr>
-        <w:tc>
-          <w:tcPr>
-            <w:tcW w:type="dxa" w:w="2600"/>
-            <w:tcMar>
-              <w:top w:w="90" w:type="dxa"/>
-              <w:start w:w="120" w:type="dxa"/>
-              <w:bottom w:w="90" w:type="dxa"/>
-              <w:end w:w="120" w:type="dxa"/>
-            </w:tcMar>
-            <w:vAlign w:val="center"/>
-          </w:tcPr>
-          <w:p>
-            <w:pPr>
-              <w:spacing w:after="0"/>
-            </w:pPr>
-            <w:r>
-              <w:rPr>
-                <w:rFonts w:ascii="Arial" w:hAnsi="Arial"/>
-                <w:sz w:val="18"/>
-              </w:rPr>
-              <w:t>Localização (GLPI)</w:t>
-            </w:r>
-          </w:p>
-        </w:tc>
-        <w:tc>
-          <w:tcPr>
-            <w:tcW w:type="dxa" w:w="6760"/>
-            <w:tcMar>
-              <w:top w:w="90" w:type="dxa"/>
-              <w:start w:w="120" w:type="dxa"/>
-              <w:bottom w:w="90" w:type="dxa"/>
-              <w:end w:w="120" w:type="dxa"/>
-            </w:tcMar>
-            <w:vAlign w:val="center"/>
-          </w:tcPr>
-          <w:p>
-            <w:pPr>
-              <w:spacing w:after="0"/>
-            </w:pPr>
-            <w:r>
-              <w:rPr>
-                <w:rFonts w:ascii="Arial" w:hAnsi="Arial"/>
-                <w:sz w:val="18"/>
-              </w:rPr>
-              <w:t>Conceito: campo do cadastro do ativo que indica fisicamente/logicamente onde ele se encontra. É esse campo que classifica um ativo como pertencente a um dos estoques.</w:t>
-            </w:r>
-          </w:p>
-        </w:tc>
-      </w:tr>
-      <w:tr>
-        <w:tc>
-          <w:tcPr>
-            <w:tcW w:type="dxa" w:w="2600"/>
-            <w:tcMar>
-              <w:top w:w="90" w:type="dxa"/>
-              <w:start w:w="120" w:type="dxa"/>
-              <w:bottom w:w="90" w:type="dxa"/>
-              <w:end w:w="120" w:type="dxa"/>
-            </w:tcMar>
-            <w:vAlign w:val="center"/>
-          </w:tcPr>
-          <w:p>
-            <w:pPr>
-              <w:spacing w:after="0"/>
-            </w:pPr>
-            <w:r>
-              <w:rPr>
-                <w:rFonts w:ascii="Arial" w:hAnsi="Arial"/>
-                <w:sz w:val="18"/>
-              </w:rPr>
-              <w:t>Estoque Manutenção</w:t>
-            </w:r>
-          </w:p>
-        </w:tc>
-        <w:tc>
-          <w:tcPr>
-            <w:tcW w:type="dxa" w:w="6760"/>
-            <w:tcMar>
-              <w:top w:w="90" w:type="dxa"/>
-              <w:start w:w="120" w:type="dxa"/>
-              <w:bottom w:w="90" w:type="dxa"/>
-              <w:end w:w="120" w:type="dxa"/>
-            </w:tcMar>
-            <w:vAlign w:val="center"/>
-          </w:tcPr>
-          <w:p>
-            <w:pPr>
-              <w:spacing w:after="0"/>
-            </w:pPr>
-            <w:r>
-              <w:rPr>
-                <w:rFonts w:ascii="Arial" w:hAnsi="Arial"/>
-                <w:sz w:val="18"/>
-              </w:rPr>
-              <w:t>Conceito: localização que representa ativos temporariamente fora de uso porque estão aguardando reparo, revisão ou peças — ainda com expectativa de retorno ao uso.</w:t>
-            </w:r>
-          </w:p>
-        </w:tc>
-      </w:tr>
-      <w:tr>
-        <w:tc>
-          <w:tcPr>
-            <w:tcW w:type="dxa" w:w="2600"/>
-            <w:tcMar>
-              <w:top w:w="90" w:type="dxa"/>
-              <w:start w:w="120" w:type="dxa"/>
-              <w:bottom w:w="90" w:type="dxa"/>
-              <w:end w:w="120" w:type="dxa"/>
-            </w:tcMar>
-            <w:vAlign w:val="center"/>
-          </w:tcPr>
-          <w:p>
-            <w:pPr>
-              <w:spacing w:after="0"/>
-            </w:pPr>
-            <w:r>
-              <w:rPr>
-                <w:rFonts w:ascii="Arial" w:hAnsi="Arial"/>
-                <w:sz w:val="18"/>
-              </w:rPr>
-              <w:t>Estoque Temporário</w:t>
-            </w:r>
-          </w:p>
-        </w:tc>
-        <w:tc>
-          <w:tcPr>
-            <w:tcW w:type="dxa" w:w="6760"/>
-            <w:tcMar>
-              <w:top w:w="90" w:type="dxa"/>
-              <w:start w:w="120" w:type="dxa"/>
-              <w:bottom w:w="90" w:type="dxa"/>
-              <w:end w:w="120" w:type="dxa"/>
-            </w:tcMar>
-            <w:vAlign w:val="center"/>
-          </w:tcPr>
-          <w:p>
-            <w:pPr>
-              <w:spacing w:after="0"/>
-            </w:pPr>
-            <w:r>
-              <w:rPr>
-                <w:rFonts w:ascii="Arial" w:hAnsi="Arial"/>
-                <w:sz w:val="18"/>
-              </w:rPr>
-              <w:t>Conceito: localização que representa ativos disponíveis e funcionais, mas sem usuário ou destino definido no momento — aguardando remanejamento.</w:t>
-            </w:r>
-          </w:p>
-        </w:tc>
-      </w:tr>
-      <w:tr>
-        <w:tc>
-          <w:tcPr>
-            <w:tcW w:type="dxa" w:w="2600"/>
-            <w:tcMar>
-              <w:top w:w="90" w:type="dxa"/>
-              <w:start w:w="120" w:type="dxa"/>
-              <w:bottom w:w="90" w:type="dxa"/>
-              <w:end w:w="120" w:type="dxa"/>
-            </w:tcMar>
-            <w:vAlign w:val="center"/>
-          </w:tcPr>
-          <w:p>
-            <w:pPr>
-              <w:spacing w:after="0"/>
-            </w:pPr>
-            <w:r>
-              <w:rPr>
-                <w:rFonts w:ascii="Arial" w:hAnsi="Arial"/>
-                <w:sz w:val="18"/>
-              </w:rPr>
-              <w:t>Estoque Descarte</w:t>
-            </w:r>
-          </w:p>
-        </w:tc>
-        <w:tc>
-          <w:tcPr>
-            <w:tcW w:type="dxa" w:w="6760"/>
-            <w:tcMar>
-              <w:top w:w="90" w:type="dxa"/>
-              <w:start w:w="120" w:type="dxa"/>
-              <w:bottom w:w="90" w:type="dxa"/>
-              <w:end w:w="120" w:type="dxa"/>
-            </w:tcMar>
-            <w:vAlign w:val="center"/>
-          </w:tcPr>
-          <w:p>
-            <w:pPr>
-              <w:spacing w:after="0"/>
-            </w:pPr>
-            <w:r>
-              <w:rPr>
-                <w:rFonts w:ascii="Arial" w:hAnsi="Arial"/>
-                <w:sz w:val="18"/>
-              </w:rPr>
-              <w:t>Conceito: localização que representa ativos condenados ou sem condição de reaproveitamento, sem expectativa de retorno ao uso, aguardando baixa patrimonial.</w:t>
-            </w:r>
-          </w:p>
-        </w:tc>
-      </w:tr>
-    </w:tbl>
-    <w:p>
-      <w:pPr>
-        <w:spacing w:after="40"/>
-      </w:pPr>
-    </w:p>
-    <w:p>
-      <w:pPr>
-        <w:pStyle w:val="Heading1"/>
-      </w:pPr>
-      <w:r>
-        <w:t>Fluxo resumido Visão rápida</w:t>
+        <w:t>Fluxo resumido</w:t>
       </w:r>
     </w:p>
     <w:p>
@@ -824,7 +439,7 @@
         <w:pStyle w:val="Heading1"/>
       </w:pPr>
       <w:r>
-        <w:t>Processo 1 Critério de Classificação por Localização</w:t>
+        <w:t>Processo 1 - Critério de Classificação por Localização</w:t>
       </w:r>
     </w:p>
     <w:p>
@@ -1483,7 +1098,7 @@
         <w:pStyle w:val="Heading1"/>
       </w:pPr>
       <w:r>
-        <w:t>Processo 2 Construção da Visão de Estoque — Etapa 1: Descarte</w:t>
+        <w:t>Processo 2 - Construção da Visão de Estoque — Etapa 1: Descarte</w:t>
       </w:r>
     </w:p>
     <w:p>
@@ -2136,6 +1751,391 @@
         <w:pStyle w:val="Heading1"/>
       </w:pPr>
       <w:r>
+        <w:t>Definições</w:t>
+      </w:r>
+    </w:p>
+    <w:tbl>
+      <w:tblPr>
+        <w:tblStyle w:val="TableGrid"/>
+        <w:tblW w:type="auto" w:w="0"/>
+        <w:jc w:val="center"/>
+        <w:tblLayout w:type="fixed"/>
+        <w:tblLook w:firstColumn="1" w:firstRow="1" w:lastColumn="0" w:lastRow="0" w:noHBand="0" w:noVBand="1" w:val="04A0"/>
+      </w:tblPr>
+      <w:tblGrid>
+        <w:gridCol w:w="2600"/>
+        <w:gridCol w:w="6760"/>
+      </w:tblGrid>
+      <w:tr>
+        <w:trPr>
+          <w:tblHeader w:val="true"/>
+        </w:trPr>
+        <w:tc>
+          <w:tcPr>
+            <w:tcW w:type="dxa" w:w="2600"/>
+            <w:tcMar>
+              <w:top w:w="90" w:type="dxa"/>
+              <w:start w:w="120" w:type="dxa"/>
+              <w:bottom w:w="90" w:type="dxa"/>
+              <w:end w:w="120" w:type="dxa"/>
+            </w:tcMar>
+            <w:vAlign w:val="center"/>
+            <w:shd w:fill="EAF2F8"/>
+          </w:tcPr>
+          <w:p>
+            <w:pPr>
+              <w:spacing w:after="0"/>
+            </w:pPr>
+            <w:r>
+              <w:rPr>
+                <w:rFonts w:ascii="Arial" w:hAnsi="Arial"/>
+                <w:b/>
+                <w:color w:val="163A63"/>
+                <w:sz w:val="18"/>
+              </w:rPr>
+              <w:t>Termo</w:t>
+            </w:r>
+          </w:p>
+        </w:tc>
+        <w:tc>
+          <w:tcPr>
+            <w:tcW w:type="dxa" w:w="6760"/>
+            <w:tcMar>
+              <w:top w:w="90" w:type="dxa"/>
+              <w:start w:w="120" w:type="dxa"/>
+              <w:bottom w:w="90" w:type="dxa"/>
+              <w:end w:w="120" w:type="dxa"/>
+            </w:tcMar>
+            <w:vAlign w:val="center"/>
+            <w:shd w:fill="EAF2F8"/>
+          </w:tcPr>
+          <w:p>
+            <w:pPr>
+              <w:spacing w:after="0"/>
+            </w:pPr>
+            <w:r>
+              <w:rPr>
+                <w:rFonts w:ascii="Arial" w:hAnsi="Arial"/>
+                <w:b/>
+                <w:color w:val="163A63"/>
+                <w:sz w:val="18"/>
+              </w:rPr>
+              <w:t>Definição</w:t>
+            </w:r>
+          </w:p>
+        </w:tc>
+      </w:tr>
+      <w:tr>
+        <w:tc>
+          <w:tcPr>
+            <w:tcW w:type="dxa" w:w="2600"/>
+            <w:tcMar>
+              <w:top w:w="90" w:type="dxa"/>
+              <w:start w:w="120" w:type="dxa"/>
+              <w:bottom w:w="90" w:type="dxa"/>
+              <w:end w:w="120" w:type="dxa"/>
+            </w:tcMar>
+            <w:vAlign w:val="center"/>
+          </w:tcPr>
+          <w:p>
+            <w:pPr>
+              <w:spacing w:after="0"/>
+            </w:pPr>
+            <w:r>
+              <w:rPr>
+                <w:rFonts w:ascii="Arial" w:hAnsi="Arial"/>
+                <w:sz w:val="18"/>
+              </w:rPr>
+              <w:t>GLPI</w:t>
+            </w:r>
+          </w:p>
+        </w:tc>
+        <w:tc>
+          <w:tcPr>
+            <w:tcW w:type="dxa" w:w="6760"/>
+            <w:tcMar>
+              <w:top w:w="90" w:type="dxa"/>
+              <w:start w:w="120" w:type="dxa"/>
+              <w:bottom w:w="90" w:type="dxa"/>
+              <w:end w:w="120" w:type="dxa"/>
+            </w:tcMar>
+            <w:vAlign w:val="center"/>
+          </w:tcPr>
+          <w:p>
+            <w:pPr>
+              <w:spacing w:after="0"/>
+            </w:pPr>
+            <w:r>
+              <w:rPr>
+                <w:rFonts w:ascii="Arial" w:hAnsi="Arial"/>
+                <w:sz w:val="18"/>
+              </w:rPr>
+              <w:t>Sistema de gestão de chamados e inventário de TI utilizado pela GTIC.</w:t>
+            </w:r>
+          </w:p>
+        </w:tc>
+      </w:tr>
+      <w:tr>
+        <w:tc>
+          <w:tcPr>
+            <w:tcW w:type="dxa" w:w="2600"/>
+            <w:tcMar>
+              <w:top w:w="90" w:type="dxa"/>
+              <w:start w:w="120" w:type="dxa"/>
+              <w:bottom w:w="90" w:type="dxa"/>
+              <w:end w:w="120" w:type="dxa"/>
+            </w:tcMar>
+            <w:vAlign w:val="center"/>
+          </w:tcPr>
+          <w:p>
+            <w:pPr>
+              <w:spacing w:after="0"/>
+            </w:pPr>
+            <w:r>
+              <w:rPr>
+                <w:rFonts w:ascii="Arial" w:hAnsi="Arial"/>
+                <w:sz w:val="18"/>
+              </w:rPr>
+              <w:t>Visão de Estoque</w:t>
+            </w:r>
+          </w:p>
+        </w:tc>
+        <w:tc>
+          <w:tcPr>
+            <w:tcW w:type="dxa" w:w="6760"/>
+            <w:tcMar>
+              <w:top w:w="90" w:type="dxa"/>
+              <w:start w:w="120" w:type="dxa"/>
+              <w:bottom w:w="90" w:type="dxa"/>
+              <w:end w:w="120" w:type="dxa"/>
+            </w:tcMar>
+            <w:vAlign w:val="center"/>
+          </w:tcPr>
+          <w:p>
+            <w:pPr>
+              <w:spacing w:after="0"/>
+            </w:pPr>
+            <w:r>
+              <w:rPr>
+                <w:rFonts w:ascii="Arial" w:hAnsi="Arial"/>
+                <w:sz w:val="18"/>
+              </w:rPr>
+              <w:t>Conceito: uma forma organizada de consultar, dentro do GLPI, todos os ativos que estão fora de uso ativo — reunindo em um único lugar o que hoje está disperso entre diferentes localizações de estoque.</w:t>
+            </w:r>
+          </w:p>
+        </w:tc>
+      </w:tr>
+      <w:tr>
+        <w:tc>
+          <w:tcPr>
+            <w:tcW w:type="dxa" w:w="2600"/>
+            <w:tcMar>
+              <w:top w:w="90" w:type="dxa"/>
+              <w:start w:w="120" w:type="dxa"/>
+              <w:bottom w:w="90" w:type="dxa"/>
+              <w:end w:w="120" w:type="dxa"/>
+            </w:tcMar>
+            <w:vAlign w:val="center"/>
+          </w:tcPr>
+          <w:p>
+            <w:pPr>
+              <w:spacing w:after="0"/>
+            </w:pPr>
+            <w:r>
+              <w:rPr>
+                <w:rFonts w:ascii="Arial" w:hAnsi="Arial"/>
+                <w:sz w:val="18"/>
+              </w:rPr>
+              <w:t>Localização (GLPI)</w:t>
+            </w:r>
+          </w:p>
+        </w:tc>
+        <w:tc>
+          <w:tcPr>
+            <w:tcW w:type="dxa" w:w="6760"/>
+            <w:tcMar>
+              <w:top w:w="90" w:type="dxa"/>
+              <w:start w:w="120" w:type="dxa"/>
+              <w:bottom w:w="90" w:type="dxa"/>
+              <w:end w:w="120" w:type="dxa"/>
+            </w:tcMar>
+            <w:vAlign w:val="center"/>
+          </w:tcPr>
+          <w:p>
+            <w:pPr>
+              <w:spacing w:after="0"/>
+            </w:pPr>
+            <w:r>
+              <w:rPr>
+                <w:rFonts w:ascii="Arial" w:hAnsi="Arial"/>
+                <w:sz w:val="18"/>
+              </w:rPr>
+              <w:t>Conceito: campo do cadastro do ativo que indica fisicamente/logicamente onde ele se encontra. É esse campo que classifica um ativo como pertencente a um dos estoques.</w:t>
+            </w:r>
+          </w:p>
+        </w:tc>
+      </w:tr>
+      <w:tr>
+        <w:tc>
+          <w:tcPr>
+            <w:tcW w:type="dxa" w:w="2600"/>
+            <w:tcMar>
+              <w:top w:w="90" w:type="dxa"/>
+              <w:start w:w="120" w:type="dxa"/>
+              <w:bottom w:w="90" w:type="dxa"/>
+              <w:end w:w="120" w:type="dxa"/>
+            </w:tcMar>
+            <w:vAlign w:val="center"/>
+          </w:tcPr>
+          <w:p>
+            <w:pPr>
+              <w:spacing w:after="0"/>
+            </w:pPr>
+            <w:r>
+              <w:rPr>
+                <w:rFonts w:ascii="Arial" w:hAnsi="Arial"/>
+                <w:sz w:val="18"/>
+              </w:rPr>
+              <w:t>Estoque Manutenção</w:t>
+            </w:r>
+          </w:p>
+        </w:tc>
+        <w:tc>
+          <w:tcPr>
+            <w:tcW w:type="dxa" w:w="6760"/>
+            <w:tcMar>
+              <w:top w:w="90" w:type="dxa"/>
+              <w:start w:w="120" w:type="dxa"/>
+              <w:bottom w:w="90" w:type="dxa"/>
+              <w:end w:w="120" w:type="dxa"/>
+            </w:tcMar>
+            <w:vAlign w:val="center"/>
+          </w:tcPr>
+          <w:p>
+            <w:pPr>
+              <w:spacing w:after="0"/>
+            </w:pPr>
+            <w:r>
+              <w:rPr>
+                <w:rFonts w:ascii="Arial" w:hAnsi="Arial"/>
+                <w:sz w:val="18"/>
+              </w:rPr>
+              <w:t>Conceito: localização que representa ativos temporariamente fora de uso porque estão aguardando reparo, revisão ou peças — ainda com expectativa de retorno ao uso.</w:t>
+            </w:r>
+          </w:p>
+        </w:tc>
+      </w:tr>
+      <w:tr>
+        <w:tc>
+          <w:tcPr>
+            <w:tcW w:type="dxa" w:w="2600"/>
+            <w:tcMar>
+              <w:top w:w="90" w:type="dxa"/>
+              <w:start w:w="120" w:type="dxa"/>
+              <w:bottom w:w="90" w:type="dxa"/>
+              <w:end w:w="120" w:type="dxa"/>
+            </w:tcMar>
+            <w:vAlign w:val="center"/>
+          </w:tcPr>
+          <w:p>
+            <w:pPr>
+              <w:spacing w:after="0"/>
+            </w:pPr>
+            <w:r>
+              <w:rPr>
+                <w:rFonts w:ascii="Arial" w:hAnsi="Arial"/>
+                <w:sz w:val="18"/>
+              </w:rPr>
+              <w:t>Estoque Temporário</w:t>
+            </w:r>
+          </w:p>
+        </w:tc>
+        <w:tc>
+          <w:tcPr>
+            <w:tcW w:type="dxa" w:w="6760"/>
+            <w:tcMar>
+              <w:top w:w="90" w:type="dxa"/>
+              <w:start w:w="120" w:type="dxa"/>
+              <w:bottom w:w="90" w:type="dxa"/>
+              <w:end w:w="120" w:type="dxa"/>
+            </w:tcMar>
+            <w:vAlign w:val="center"/>
+          </w:tcPr>
+          <w:p>
+            <w:pPr>
+              <w:spacing w:after="0"/>
+            </w:pPr>
+            <w:r>
+              <w:rPr>
+                <w:rFonts w:ascii="Arial" w:hAnsi="Arial"/>
+                <w:sz w:val="18"/>
+              </w:rPr>
+              <w:t>Conceito: localização que representa ativos disponíveis e funcionais, mas sem usuário ou destino definido no momento — aguardando remanejamento.</w:t>
+            </w:r>
+          </w:p>
+        </w:tc>
+      </w:tr>
+      <w:tr>
+        <w:tc>
+          <w:tcPr>
+            <w:tcW w:type="dxa" w:w="2600"/>
+            <w:tcMar>
+              <w:top w:w="90" w:type="dxa"/>
+              <w:start w:w="120" w:type="dxa"/>
+              <w:bottom w:w="90" w:type="dxa"/>
+              <w:end w:w="120" w:type="dxa"/>
+            </w:tcMar>
+            <w:vAlign w:val="center"/>
+          </w:tcPr>
+          <w:p>
+            <w:pPr>
+              <w:spacing w:after="0"/>
+            </w:pPr>
+            <w:r>
+              <w:rPr>
+                <w:rFonts w:ascii="Arial" w:hAnsi="Arial"/>
+                <w:sz w:val="18"/>
+              </w:rPr>
+              <w:t>Estoque Descarte</w:t>
+            </w:r>
+          </w:p>
+        </w:tc>
+        <w:tc>
+          <w:tcPr>
+            <w:tcW w:type="dxa" w:w="6760"/>
+            <w:tcMar>
+              <w:top w:w="90" w:type="dxa"/>
+              <w:start w:w="120" w:type="dxa"/>
+              <w:bottom w:w="90" w:type="dxa"/>
+              <w:end w:w="120" w:type="dxa"/>
+            </w:tcMar>
+            <w:vAlign w:val="center"/>
+          </w:tcPr>
+          <w:p>
+            <w:pPr>
+              <w:spacing w:after="0"/>
+            </w:pPr>
+            <w:r>
+              <w:rPr>
+                <w:rFonts w:ascii="Arial" w:hAnsi="Arial"/>
+                <w:sz w:val="18"/>
+              </w:rPr>
+              <w:t>Conceito: localização que representa ativos condenados ou sem condição de reaproveitamento, sem expectativa de retorno ao uso, aguardando baixa patrimonial.</w:t>
+            </w:r>
+          </w:p>
+        </w:tc>
+      </w:tr>
+    </w:tbl>
+    <w:p>
+      <w:pPr>
+        <w:spacing w:after="40"/>
+      </w:pPr>
+    </w:p>
+    <w:p>
+      <w:pPr>
+        <w:pStyle w:val="Heading1"/>
+      </w:pPr>
+      <w:r>
         <w:t>Pontos de Atenção</w:t>
       </w:r>
     </w:p>
@@ -2193,7 +2193,7 @@
         <w:pStyle w:val="Heading1"/>
       </w:pPr>
       <w:r>
-        <w:t>Histórico de Revisões</w:t>
+        <w:t>Histórico de Revisão</w:t>
       </w:r>
     </w:p>
     <w:tbl>

</xml_diff>